<commit_message>
Add Moodle project import, improve pagination and export
- bin/wp-moodle.cjs: create projects from Moodle assignment URLs
- electron/main.cjs and bin/wp.cjs: window/project handling and CLI updates
- DocumentPreview/App: pagination and standalone HTML export refinements
- ConfigDrawer, BibliographyDrawer, ProjectPanel, markdown/bib parsers: fixes
</commit_message>
<xml_diff>
--- a/public/unemi-tmp.docx
+++ b/public/unemi-tmp.docx
@@ -2853,6 +2853,20 @@
       <w:szCs w:val="24"/>
     </w:rPr>
   </w:style>
+  <w:style w:type="paragraph" w:customStyle="1" w:styleId="Bibliography">
+    <w:name w:val="Bibliography"/>
+    <w:basedOn w:val="BodyText"/>
+    <w:uiPriority w:val="99"/>
+    <w:semiHidden/>
+    <w:unhideWhenUsed/>
+    <w:qFormat/>
+    <w:pPr>
+      <w:widowControl w:val="false"/>
+      <w:spacing w:lineRule="auto" w:line="240" w:before="0" w:after="200"/>
+      <w:ind w:left="720" w:hanging="720"/>
+      <w:jc w:val="start"/>
+    </w:pPr>
+  </w:style>
   <w:style w:type="paragraph" w:styleId="List">
     <w:name w:val="List"/>
     <w:basedOn w:val="BodyText"/>

</xml_diff>